<commit_message>
Upload U3/U4 printable exam PDFs and answer keys (Unicode paths).
</commit_message>
<xml_diff>
--- a/printables/u04/04-考前测试/U4_四上_第四单元_加法模型和乘法模型_答案.docx
+++ b/printables/u04/04-考前测试/U4_四上_第四单元_加法模型和乘法模型_答案.docx
@@ -13,7 +13,7 @@
           <w:b/>
           <w:sz w:val="28"/>
         </w:rPr>
-        <w:t>第四单元 · 数量模型 · 参考答案</w:t>
+        <w:t>第四单元 · 加法模型和乘法模型 · 参考答案</w:t>
       </w:r>
     </w:p>
     <w:p>
@@ -32,16 +32,444 @@
     </w:p>
     <w:p>
       <w:pPr>
-        <w:spacing w:before="0" w:after="60" w:line="307" w:lineRule="auto"/>
+        <w:spacing w:before="80" w:after="40" w:line="307" w:lineRule="auto"/>
+      </w:pPr>
+      <w:r>
+        <w:rPr>
+          <w:rFonts w:ascii="宋体" w:hAnsi="宋体" w:eastAsia="宋体"/>
+          <w:b/>
+          <w:sz w:val="22"/>
+        </w:rPr>
+        <w:t>第四单元 · 加法模型和乘法模型 · 参考答案</w:t>
+      </w:r>
+    </w:p>
+    <w:p>
+      <w:pPr>
+        <w:spacing w:before="80" w:after="40" w:line="307" w:lineRule="auto"/>
+      </w:pPr>
+      <w:r>
+        <w:rPr>
+          <w:rFonts w:ascii="宋体" w:hAnsi="宋体" w:eastAsia="宋体"/>
+          <w:b/>
+          <w:sz w:val="22"/>
+        </w:rPr>
+        <w:t>一、填空</w:t>
+      </w:r>
+    </w:p>
+    <w:p>
+      <w:pPr>
+        <w:spacing w:before="0" w:after="20" w:line="307" w:lineRule="auto"/>
       </w:pPr>
       <w:r>
         <w:rPr>
           <w:rFonts w:ascii="宋体" w:hAnsi="宋体" w:eastAsia="宋体"/>
           <w:b w:val="0"/>
-          <w:color w:val="1E7EB8"/>
-          <w:sz w:val="20"/>
+          <w:sz w:val="19"/>
         </w:rPr>
-        <w:t>参考答案待按原卷补全。</w:t>
+        <w:t>1. 621；总数－上午＝下午（或：总数－部分＝另一部分）</w:t>
+      </w:r>
+    </w:p>
+    <w:p>
+      <w:pPr>
+        <w:spacing w:before="0" w:after="20" w:line="307" w:lineRule="auto"/>
+      </w:pPr>
+      <w:r>
+        <w:rPr>
+          <w:rFonts w:ascii="宋体" w:hAnsi="宋体" w:eastAsia="宋体"/>
+          <w:b w:val="0"/>
+          <w:sz w:val="19"/>
+        </w:rPr>
+        <w:t>2. 1620；单价×数量＝总价（108×15）</w:t>
+      </w:r>
+    </w:p>
+    <w:p>
+      <w:pPr>
+        <w:spacing w:before="0" w:after="20" w:line="307" w:lineRule="auto"/>
+      </w:pPr>
+      <w:r>
+        <w:rPr>
+          <w:rFonts w:ascii="宋体" w:hAnsi="宋体" w:eastAsia="宋体"/>
+          <w:b w:val="0"/>
+          <w:sz w:val="19"/>
+        </w:rPr>
+        <w:t>3. 80（已行 274－34＝240，240÷3＝80）</w:t>
+      </w:r>
+    </w:p>
+    <w:p>
+      <w:pPr>
+        <w:spacing w:before="0" w:after="20" w:line="307" w:lineRule="auto"/>
+      </w:pPr>
+      <w:r>
+        <w:rPr>
+          <w:rFonts w:ascii="宋体" w:hAnsi="宋体" w:eastAsia="宋体"/>
+          <w:b w:val="0"/>
+          <w:sz w:val="19"/>
+        </w:rPr>
+        <w:t>4. 272（女生 113＋46＝159，共 113＋159＝272）</w:t>
+      </w:r>
+    </w:p>
+    <w:p>
+      <w:pPr>
+        <w:spacing w:before="0" w:after="20" w:line="307" w:lineRule="auto"/>
+      </w:pPr>
+      <w:r>
+        <w:rPr>
+          <w:rFonts w:ascii="宋体" w:hAnsi="宋体" w:eastAsia="宋体"/>
+          <w:b w:val="0"/>
+          <w:sz w:val="19"/>
+        </w:rPr>
+        <w:t>5. （1）单价</w:t>
+      </w:r>
+    </w:p>
+    <w:p>
+      <w:pPr>
+        <w:spacing w:before="0" w:after="20" w:line="307" w:lineRule="auto"/>
+      </w:pPr>
+      <w:r>
+        <w:rPr>
+          <w:rFonts w:ascii="宋体" w:hAnsi="宋体" w:eastAsia="宋体"/>
+          <w:b w:val="0"/>
+          <w:sz w:val="19"/>
+        </w:rPr>
+        <w:t xml:space="preserve">   （2）已知单价和数量，求总价</w:t>
+      </w:r>
+    </w:p>
+    <w:p>
+      <w:pPr>
+        <w:spacing w:before="0" w:after="20" w:line="307" w:lineRule="auto"/>
+      </w:pPr>
+      <w:r>
+        <w:rPr>
+          <w:rFonts w:ascii="宋体" w:hAnsi="宋体" w:eastAsia="宋体"/>
+          <w:b w:val="0"/>
+          <w:sz w:val="19"/>
+        </w:rPr>
+        <w:t xml:space="preserve">   （3）总价＝单价×数量</w:t>
+      </w:r>
+    </w:p>
+    <w:p>
+      <w:pPr>
+        <w:spacing w:before="0" w:after="20" w:line="307" w:lineRule="auto"/>
+      </w:pPr>
+      <w:r>
+        <w:rPr>
+          <w:rFonts w:ascii="宋体" w:hAnsi="宋体" w:eastAsia="宋体"/>
+          <w:b w:val="0"/>
+          <w:sz w:val="19"/>
+        </w:rPr>
+        <w:t>6. 高铁列车（用时 6 小时，速度约 1260÷6＝210 千米/时，最接近 230）</w:t>
+      </w:r>
+    </w:p>
+    <w:p>
+      <w:pPr>
+        <w:spacing w:before="0" w:after="20" w:line="307" w:lineRule="auto"/>
+      </w:pPr>
+      <w:r>
+        <w:rPr>
+          <w:rFonts w:ascii="宋体" w:hAnsi="宋体" w:eastAsia="宋体"/>
+          <w:b w:val="0"/>
+          <w:sz w:val="19"/>
+        </w:rPr>
+        <w:t>7. 20；2500（箭头指向 125×20 的部分积）</w:t>
+      </w:r>
+    </w:p>
+    <w:p>
+      <w:pPr>
+        <w:spacing w:before="80" w:after="40" w:line="307" w:lineRule="auto"/>
+      </w:pPr>
+      <w:r>
+        <w:rPr>
+          <w:rFonts w:ascii="宋体" w:hAnsi="宋体" w:eastAsia="宋体"/>
+          <w:b/>
+          <w:sz w:val="22"/>
+        </w:rPr>
+        <w:t>二、选一选</w:t>
+      </w:r>
+    </w:p>
+    <w:p>
+      <w:pPr>
+        <w:spacing w:before="0" w:after="20" w:line="307" w:lineRule="auto"/>
+      </w:pPr>
+      <w:r>
+        <w:rPr>
+          <w:rFonts w:ascii="宋体" w:hAnsi="宋体" w:eastAsia="宋体"/>
+          <w:b w:val="0"/>
+          <w:sz w:val="19"/>
+        </w:rPr>
+        <w:t>1. ② 路程</w:t>
+      </w:r>
+    </w:p>
+    <w:p>
+      <w:pPr>
+        <w:spacing w:before="0" w:after="20" w:line="307" w:lineRule="auto"/>
+      </w:pPr>
+      <w:r>
+        <w:rPr>
+          <w:rFonts w:ascii="宋体" w:hAnsi="宋体" w:eastAsia="宋体"/>
+          <w:b w:val="0"/>
+          <w:sz w:val="19"/>
+        </w:rPr>
+        <w:t>2. ① 单价</w:t>
+      </w:r>
+    </w:p>
+    <w:p>
+      <w:pPr>
+        <w:spacing w:before="0" w:after="20" w:line="307" w:lineRule="auto"/>
+      </w:pPr>
+      <w:r>
+        <w:rPr>
+          <w:rFonts w:ascii="宋体" w:hAnsi="宋体" w:eastAsia="宋体"/>
+          <w:b w:val="0"/>
+          <w:sz w:val="19"/>
+        </w:rPr>
+        <w:t>3. ③ 民用客机（约 900 千米/时最快；①≈72 千米/时，②＝300 千米/时，④＝90 千米/时）</w:t>
+      </w:r>
+    </w:p>
+    <w:p>
+      <w:pPr>
+        <w:spacing w:before="0" w:after="20" w:line="307" w:lineRule="auto"/>
+      </w:pPr>
+      <w:r>
+        <w:rPr>
+          <w:rFonts w:ascii="宋体" w:hAnsi="宋体" w:eastAsia="宋体"/>
+          <w:b w:val="0"/>
+          <w:sz w:val="19"/>
+        </w:rPr>
+        <w:t>4. ②（竖式中 450＝225×2，表示 2 分钟路程；若原卷箭头指移位的 2250 则选 ③）</w:t>
+      </w:r>
+    </w:p>
+    <w:p>
+      <w:pPr>
+        <w:spacing w:before="0" w:after="20" w:line="307" w:lineRule="auto"/>
+      </w:pPr>
+      <w:r>
+        <w:rPr>
+          <w:rFonts w:ascii="宋体" w:hAnsi="宋体" w:eastAsia="宋体"/>
+          <w:b w:val="0"/>
+          <w:sz w:val="19"/>
+        </w:rPr>
+        <w:t>5. ③（面积＝15×(15×4)＝15×60，不能只用 15×4；①②④均可直接用 15×4）</w:t>
+      </w:r>
+    </w:p>
+    <w:p>
+      <w:pPr>
+        <w:spacing w:before="0" w:after="20" w:line="307" w:lineRule="auto"/>
+      </w:pPr>
+      <w:r>
+        <w:rPr>
+          <w:rFonts w:ascii="宋体" w:hAnsi="宋体" w:eastAsia="宋体"/>
+          <w:b w:val="0"/>
+          <w:sz w:val="19"/>
+        </w:rPr>
+        <w:t>6. ③（3×[14÷(4＋3)]＝乐乐相遇时所行路程）</w:t>
+      </w:r>
+    </w:p>
+    <w:p>
+      <w:pPr>
+        <w:spacing w:before="0" w:after="20" w:line="307" w:lineRule="auto"/>
+      </w:pPr>
+      <w:r>
+        <w:rPr>
+          <w:rFonts w:ascii="宋体" w:hAnsi="宋体" w:eastAsia="宋体"/>
+          <w:b w:val="0"/>
+          <w:sz w:val="19"/>
+        </w:rPr>
+        <w:t>7. ③（走了 20 分钟×50＝1000 米，全程约 1200 米，最可能到 ③ 处）</w:t>
+      </w:r>
+    </w:p>
+    <w:p>
+      <w:pPr>
+        <w:spacing w:before="80" w:after="40" w:line="307" w:lineRule="auto"/>
+      </w:pPr>
+      <w:r>
+        <w:rPr>
+          <w:rFonts w:ascii="宋体" w:hAnsi="宋体" w:eastAsia="宋体"/>
+          <w:b/>
+          <w:sz w:val="22"/>
+        </w:rPr>
+        <w:t>三、竖式计算</w:t>
+      </w:r>
+    </w:p>
+    <w:p>
+      <w:pPr>
+        <w:spacing w:before="0" w:after="20" w:line="307" w:lineRule="auto"/>
+      </w:pPr>
+      <w:r>
+        <w:rPr>
+          <w:rFonts w:ascii="宋体" w:hAnsi="宋体" w:eastAsia="宋体"/>
+          <w:b w:val="0"/>
+          <w:sz w:val="19"/>
+        </w:rPr>
+        <w:t>- 354×18＝6372</w:t>
+      </w:r>
+    </w:p>
+    <w:p>
+      <w:pPr>
+        <w:spacing w:before="0" w:after="20" w:line="307" w:lineRule="auto"/>
+      </w:pPr>
+      <w:r>
+        <w:rPr>
+          <w:rFonts w:ascii="宋体" w:hAnsi="宋体" w:eastAsia="宋体"/>
+          <w:b w:val="0"/>
+          <w:sz w:val="19"/>
+        </w:rPr>
+        <w:t>- 750×40＝30000</w:t>
+      </w:r>
+    </w:p>
+    <w:p>
+      <w:pPr>
+        <w:spacing w:before="0" w:after="20" w:line="307" w:lineRule="auto"/>
+      </w:pPr>
+      <w:r>
+        <w:rPr>
+          <w:rFonts w:ascii="宋体" w:hAnsi="宋体" w:eastAsia="宋体"/>
+          <w:b w:val="0"/>
+          <w:sz w:val="19"/>
+        </w:rPr>
+        <w:t>- 75×504＝37800</w:t>
+      </w:r>
+    </w:p>
+    <w:p>
+      <w:pPr>
+        <w:spacing w:before="0" w:after="20" w:line="307" w:lineRule="auto"/>
+      </w:pPr>
+      <w:r>
+        <w:rPr>
+          <w:rFonts w:ascii="宋体" w:hAnsi="宋体" w:eastAsia="宋体"/>
+          <w:b w:val="0"/>
+          <w:sz w:val="19"/>
+        </w:rPr>
+        <w:t>- 138×25＝3450</w:t>
+      </w:r>
+    </w:p>
+    <w:p>
+      <w:pPr>
+        <w:spacing w:before="80" w:after="40" w:line="307" w:lineRule="auto"/>
+      </w:pPr>
+      <w:r>
+        <w:rPr>
+          <w:rFonts w:ascii="宋体" w:hAnsi="宋体" w:eastAsia="宋体"/>
+          <w:b/>
+          <w:sz w:val="22"/>
+        </w:rPr>
+        <w:t>四、解决问题</w:t>
+      </w:r>
+    </w:p>
+    <w:p>
+      <w:pPr>
+        <w:spacing w:before="0" w:after="20" w:line="307" w:lineRule="auto"/>
+      </w:pPr>
+      <w:r>
+        <w:rPr>
+          <w:rFonts w:ascii="宋体" w:hAnsi="宋体" w:eastAsia="宋体"/>
+          <w:b w:val="0"/>
+          <w:sz w:val="19"/>
+        </w:rPr>
+        <w:t>1. 16×120＝1920（元）</w:t>
+      </w:r>
+    </w:p>
+    <w:p>
+      <w:pPr>
+        <w:spacing w:before="0" w:after="20" w:line="307" w:lineRule="auto"/>
+      </w:pPr>
+      <w:r>
+        <w:rPr>
+          <w:rFonts w:ascii="宋体" w:hAnsi="宋体" w:eastAsia="宋体"/>
+          <w:b w:val="0"/>
+          <w:sz w:val="19"/>
+        </w:rPr>
+        <w:t>2. 速度＝900÷18＝50 米/分；450÷50＝9（分钟）</w:t>
+      </w:r>
+    </w:p>
+    <w:p>
+      <w:pPr>
+        <w:spacing w:before="0" w:after="20" w:line="307" w:lineRule="auto"/>
+      </w:pPr>
+      <w:r>
+        <w:rPr>
+          <w:rFonts w:ascii="宋体" w:hAnsi="宋体" w:eastAsia="宋体"/>
+          <w:b w:val="0"/>
+          <w:sz w:val="19"/>
+        </w:rPr>
+        <w:t>3. 一昼夜行 1000＋800＝1800 里；1800×420＝756000（米）</w:t>
+      </w:r>
+    </w:p>
+    <w:p>
+      <w:pPr>
+        <w:spacing w:before="0" w:after="20" w:line="307" w:lineRule="auto"/>
+      </w:pPr>
+      <w:r>
+        <w:rPr>
+          <w:rFonts w:ascii="宋体" w:hAnsi="宋体" w:eastAsia="宋体"/>
+          <w:b w:val="0"/>
+          <w:sz w:val="19"/>
+        </w:rPr>
+        <w:t>4. 苹果 6÷2＝3 元/千克，8×3＝24 元；葡萄 15÷3＝5 元/千克，9×5＝45 元；共 69 元</w:t>
+      </w:r>
+    </w:p>
+    <w:p>
+      <w:pPr>
+        <w:spacing w:before="0" w:after="20" w:line="307" w:lineRule="auto"/>
+      </w:pPr>
+      <w:r>
+        <w:rPr>
+          <w:rFonts w:ascii="宋体" w:hAnsi="宋体" w:eastAsia="宋体"/>
+          <w:b w:val="0"/>
+          <w:sz w:val="19"/>
+        </w:rPr>
+        <w:t>5. （1）妈妈路程 370－160＝210 km，速度 210÷3＝70 km/h</w:t>
+      </w:r>
+    </w:p>
+    <w:p>
+      <w:pPr>
+        <w:spacing w:before="0" w:after="20" w:line="307" w:lineRule="auto"/>
+      </w:pPr>
+      <w:r>
+        <w:rPr>
+          <w:rFonts w:ascii="宋体" w:hAnsi="宋体" w:eastAsia="宋体"/>
+          <w:b w:val="0"/>
+          <w:sz w:val="19"/>
+        </w:rPr>
+        <w:t xml:space="preserve">   （2）求全程的平均速度（总路程÷总时间）</w:t>
+      </w:r>
+    </w:p>
+    <w:p>
+      <w:pPr>
+        <w:spacing w:before="0" w:after="20" w:line="307" w:lineRule="auto"/>
+      </w:pPr>
+      <w:r>
+        <w:rPr>
+          <w:rFonts w:ascii="宋体" w:hAnsi="宋体" w:eastAsia="宋体"/>
+          <w:b w:val="0"/>
+          <w:sz w:val="19"/>
+        </w:rPr>
+        <w:t>6. （1）选 ①③；数量关系：路程＝速度×时间</w:t>
+      </w:r>
+    </w:p>
+    <w:p>
+      <w:pPr>
+        <w:spacing w:before="0" w:after="20" w:line="307" w:lineRule="auto"/>
+      </w:pPr>
+      <w:r>
+        <w:rPr>
+          <w:rFonts w:ascii="宋体" w:hAnsi="宋体" w:eastAsia="宋体"/>
+          <w:b w:val="0"/>
+          <w:sz w:val="19"/>
+        </w:rPr>
+        <w:t xml:space="preserve">   （2）57×(56－20)＝57×36＝2052（米）</w:t>
+      </w:r>
+    </w:p>
+    <w:p>
+      <w:pPr>
+        <w:spacing w:before="0" w:after="20" w:line="307" w:lineRule="auto"/>
+      </w:pPr>
+      <w:r>
+        <w:rPr>
+          <w:rFonts w:ascii="宋体" w:hAnsi="宋体" w:eastAsia="宋体"/>
+          <w:b w:val="0"/>
+          <w:sz w:val="19"/>
+        </w:rPr>
+        <w:t xml:space="preserve">   （3）示例：百合花单价是多少？840÷24＝35 元/束（其他合理问题亦可）</w:t>
       </w:r>
     </w:p>
     <w:sectPr>

</xml_diff>